<commit_message>
feat: número de contrato (LOJA-AAAA-MM-DD-SEQ) + valores/ordinais nas parcelas
- num_contrato gerado uma vez e guardado em banco (coluna + migração idempotente),
  sequência contínua por loja; loja fixa "INS" por ora (TODO: painel de loja)
- renderizado no cabeçalho (caixa de texto via XML) com data_contrato abaixo
- grade de parcelas: ordinal + valor na mesma célula (1ª  R$ ...), data ao lado
- slots sem parcela viram traços "--------"; linhas totalmente vazias removidas
- testes: formato/sequência do número, valores do parser, grade (ordinais/valores/
  traços/linhas removidas), à vista, substituição no cabeçalho

Co-Authored-By: Claude Opus 4.8 (1M context) <noreply@anthropic.com>
</commit_message>
<xml_diff>
--- a/modelo_contrato_final.docx
+++ b/modelo_contrato_final.docx
@@ -10555,13 +10555,13 @@
       <mc:AlternateContent>
         <mc:Choice Requires="wps">
           <w:drawing>
-            <wp:anchor distT="0" distB="0" distL="0" distR="0" simplePos="0" relativeHeight="251657216" behindDoc="1" locked="0" layoutInCell="1" allowOverlap="1" wp14:anchorId="132DA906" wp14:editId="0858ACFC">
+            <wp:anchor distT="0" distB="0" distL="0" distR="0" simplePos="0" relativeHeight="251657216" behindDoc="1" locked="0" layoutInCell="1" allowOverlap="1" wp14:anchorId="132DA906" wp14:editId="64624C4F">
               <wp:simplePos x="0" y="0"/>
               <wp:positionH relativeFrom="page">
-                <wp:posOffset>6483350</wp:posOffset>
+                <wp:posOffset>6292850</wp:posOffset>
               </wp:positionH>
               <wp:positionV relativeFrom="page">
-                <wp:posOffset>309245</wp:posOffset>
+                <wp:posOffset>327025</wp:posOffset>
               </wp:positionV>
               <wp:extent cx="1856105" cy="191770"/>
               <wp:effectExtent l="0" t="0" r="0" b="0"/>
@@ -10602,16 +10602,7 @@
                               <w:sz w:val="23"/>
                               <w:lang w:val="pt-BR"/>
                             </w:rPr>
-                            <w:t>PV-SJC-</w:t>
-                          </w:r>
-                          <w:r>
-                            <w:rPr>
-                              <w:b/>
-                              <w:spacing w:val="-5"/>
-                              <w:sz w:val="23"/>
-                              <w:lang w:val="pt-BR"/>
-                            </w:rPr>
-                            <w:t>548</w:t>
+                            <w:t>[Num_Contrato]</w:t>
                           </w:r>
                         </w:p>
                       </w:txbxContent>
@@ -10631,7 +10622,7 @@
               <v:stroke joinstyle="miter"/>
               <v:path gradientshapeok="t" o:connecttype="rect"/>
             </v:shapetype>
-            <v:shape id="Textbox 1" o:spid="_x0000_s1027" type="#_x0000_t202" style="position:absolute;margin-left:510.5pt;margin-top:24.35pt;width:146.15pt;height:15.1pt;z-index:-251659264;visibility:visible;mso-wrap-style:square;mso-wrap-distance-left:0;mso-wrap-distance-top:0;mso-wrap-distance-right:0;mso-wrap-distance-bottom:0;mso-position-horizontal:absolute;mso-position-horizontal-relative:page;mso-position-vertical:absolute;mso-position-vertical-relative:page;v-text-anchor:top" o:gfxdata="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" filled="f" stroked="f">
+            <v:shape id="Textbox 1" o:spid="_x0000_s1027" type="#_x0000_t202" style="position:absolute;margin-left:495.5pt;margin-top:25.75pt;width:146.15pt;height:15.1pt;z-index:-251659264;visibility:visible;mso-wrap-style:square;mso-wrap-distance-left:0;mso-wrap-distance-top:0;mso-wrap-distance-right:0;mso-wrap-distance-bottom:0;mso-position-horizontal:absolute;mso-position-horizontal-relative:page;mso-position-vertical:absolute;mso-position-vertical-relative:page;v-text-anchor:top" o:gfxdata="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" filled="f" stroked="f">
               <v:textbox inset="0,0,0,0">
                 <w:txbxContent>
                   <w:p>
@@ -10649,16 +10640,7 @@
                         <w:sz w:val="23"/>
                         <w:lang w:val="pt-BR"/>
                       </w:rPr>
-                      <w:t>PV-SJC-</w:t>
-                    </w:r>
-                    <w:r>
-                      <w:rPr>
-                        <w:b/>
-                        <w:spacing w:val="-5"/>
-                        <w:sz w:val="23"/>
-                        <w:lang w:val="pt-BR"/>
-                      </w:rPr>
-                      <w:t>548</w:t>
+                      <w:t>[Num_Contrato]</w:t>
                     </w:r>
                   </w:p>
                 </w:txbxContent>
@@ -10687,8 +10669,105 @@
       <w:rPr>
         <w:noProof/>
       </w:rPr>
+      <mc:AlternateContent>
+        <mc:Choice Requires="wps">
+          <w:drawing>
+            <wp:anchor distT="0" distB="0" distL="0" distR="0" simplePos="0" relativeHeight="251654656" behindDoc="1" locked="0" layoutInCell="1" allowOverlap="1" wp14:anchorId="4F6B44B4" wp14:editId="1B9128C5">
+              <wp:simplePos x="0" y="0"/>
+              <wp:positionH relativeFrom="page">
+                <wp:posOffset>6445250</wp:posOffset>
+              </wp:positionH>
+              <wp:positionV relativeFrom="page">
+                <wp:posOffset>520700</wp:posOffset>
+              </wp:positionV>
+              <wp:extent cx="826135" cy="133350"/>
+              <wp:effectExtent l="0" t="0" r="0" b="0"/>
+              <wp:wrapNone/>
+              <wp:docPr id="2" name="Textbox 2"/>
+              <wp:cNvGraphicFramePr>
+                <a:graphicFrameLocks xmlns:a="http://schemas.openxmlformats.org/drawingml/2006/main"/>
+              </wp:cNvGraphicFramePr>
+              <a:graphic xmlns:a="http://schemas.openxmlformats.org/drawingml/2006/main">
+                <a:graphicData uri="http://schemas.microsoft.com/office/word/2010/wordprocessingShape">
+                  <wps:wsp>
+                    <wps:cNvSpPr txBox="1">
+                      <a:spLocks/>
+                    </wps:cNvSpPr>
+                    <wps:spPr>
+                      <a:xfrm>
+                        <a:off x="0" y="0"/>
+                        <a:ext cx="826135" cy="133350"/>
+                      </a:xfrm>
+                      <a:prstGeom prst="rect">
+                        <a:avLst/>
+                      </a:prstGeom>
+                    </wps:spPr>
+                    <wps:txbx>
+                      <w:txbxContent>
+                        <w:p>
+                          <w:pPr>
+                            <w:pStyle w:val="BodyText"/>
+                            <w:spacing w:before="14"/>
+                            <w:ind w:left="0"/>
+                          </w:pPr>
+                          <w:r>
+                            <w:rPr>
+                              <w:color w:val="808080"/>
+                              <w:spacing w:val="-2"/>
+                            </w:rPr>
+                            <w:t>[[Data_contrato]</w:t>
+                          </w:r>
+                        </w:p>
+                      </w:txbxContent>
+                    </wps:txbx>
+                    <wps:bodyPr wrap="square" lIns="0" tIns="0" rIns="0" bIns="0" rtlCol="0">
+                      <a:noAutofit/>
+                    </wps:bodyPr>
+                  </wps:wsp>
+                </a:graphicData>
+              </a:graphic>
+              <wp14:sizeRelH relativeFrom="margin">
+                <wp14:pctWidth>0</wp14:pctWidth>
+              </wp14:sizeRelH>
+              <wp14:sizeRelV relativeFrom="margin">
+                <wp14:pctHeight>0</wp14:pctHeight>
+              </wp14:sizeRelV>
+            </wp:anchor>
+          </w:drawing>
+        </mc:Choice>
+        <mc:Fallback>
+          <w:pict>
+            <v:shape w14:anchorId="4F6B44B4" id="Textbox 2" o:spid="_x0000_s1028" type="#_x0000_t202" style="position:absolute;margin-left:507.5pt;margin-top:41pt;width:65.05pt;height:10.5pt;z-index:-251661824;visibility:visible;mso-wrap-style:square;mso-width-percent:0;mso-height-percent:0;mso-wrap-distance-left:0;mso-wrap-distance-top:0;mso-wrap-distance-right:0;mso-wrap-distance-bottom:0;mso-position-horizontal:absolute;mso-position-horizontal-relative:page;mso-position-vertical:absolute;mso-position-vertical-relative:page;mso-width-percent:0;mso-height-percent:0;mso-width-relative:margin;mso-height-relative:margin;v-text-anchor:top" o:gfxdata="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" filled="f" stroked="f">
+              <v:textbox inset="0,0,0,0">
+                <w:txbxContent>
+                  <w:p>
+                    <w:pPr>
+                      <w:pStyle w:val="BodyText"/>
+                      <w:spacing w:before="14"/>
+                      <w:ind w:left="0"/>
+                    </w:pPr>
+                    <w:r>
+                      <w:rPr>
+                        <w:color w:val="808080"/>
+                        <w:spacing w:val="-2"/>
+                      </w:rPr>
+                      <w:t>[[Data_contrato]</w:t>
+                    </w:r>
+                  </w:p>
+                </w:txbxContent>
+              </v:textbox>
+              <w10:wrap anchorx="page" anchory="page"/>
+            </v:shape>
+          </w:pict>
+        </mc:Fallback>
+      </mc:AlternateContent>
+    </w:r>
+    <w:r>
+      <w:rPr>
+        <w:noProof/>
+      </w:rPr>
       <w:drawing>
-        <wp:anchor distT="0" distB="0" distL="0" distR="0" simplePos="0" relativeHeight="251656192" behindDoc="0" locked="0" layoutInCell="1" allowOverlap="1" wp14:anchorId="08191014" wp14:editId="6579960E">
+        <wp:anchor distT="0" distB="0" distL="0" distR="0" simplePos="0" relativeHeight="251656192" behindDoc="0" locked="0" layoutInCell="1" allowOverlap="1" wp14:anchorId="08191014" wp14:editId="581323DA">
           <wp:simplePos x="0" y="0"/>
           <wp:positionH relativeFrom="margin">
             <wp:posOffset>-146050</wp:posOffset>
@@ -10736,97 +10815,6 @@
           </wp14:sizeRelV>
         </wp:anchor>
       </w:drawing>
-    </w:r>
-    <w:r>
-      <w:rPr>
-        <w:noProof/>
-      </w:rPr>
-      <mc:AlternateContent>
-        <mc:Choice Requires="wps">
-          <w:drawing>
-            <wp:anchor distT="0" distB="0" distL="0" distR="0" simplePos="0" relativeHeight="251654656" behindDoc="1" locked="0" layoutInCell="1" allowOverlap="1" wp14:anchorId="4F6B44B4" wp14:editId="613786C7">
-              <wp:simplePos x="0" y="0"/>
-              <wp:positionH relativeFrom="page">
-                <wp:posOffset>6722110</wp:posOffset>
-              </wp:positionH>
-              <wp:positionV relativeFrom="page">
-                <wp:posOffset>567055</wp:posOffset>
-              </wp:positionV>
-              <wp:extent cx="597535" cy="153670"/>
-              <wp:effectExtent l="0" t="0" r="0" b="0"/>
-              <wp:wrapNone/>
-              <wp:docPr id="2" name="Textbox 2"/>
-              <wp:cNvGraphicFramePr>
-                <a:graphicFrameLocks xmlns:a="http://schemas.openxmlformats.org/drawingml/2006/main"/>
-              </wp:cNvGraphicFramePr>
-              <a:graphic xmlns:a="http://schemas.openxmlformats.org/drawingml/2006/main">
-                <a:graphicData uri="http://schemas.microsoft.com/office/word/2010/wordprocessingShape">
-                  <wps:wsp>
-                    <wps:cNvSpPr txBox="1">
-                      <a:spLocks/>
-                    </wps:cNvSpPr>
-                    <wps:spPr>
-                      <a:xfrm>
-                        <a:off x="0" y="0"/>
-                        <a:ext cx="597535" cy="153670"/>
-                      </a:xfrm>
-                      <a:prstGeom prst="rect">
-                        <a:avLst/>
-                      </a:prstGeom>
-                    </wps:spPr>
-                    <wps:txbx>
-                      <w:txbxContent>
-                        <w:p>
-                          <w:pPr>
-                            <w:pStyle w:val="BodyText"/>
-                            <w:spacing w:before="14"/>
-                            <w:ind w:left="20"/>
-                          </w:pPr>
-                          <w:r>
-                            <w:rPr>
-                              <w:color w:val="808080"/>
-                              <w:spacing w:val="-2"/>
-                            </w:rPr>
-                            <w:t>09/06/2026</w:t>
-                          </w:r>
-                        </w:p>
-                      </w:txbxContent>
-                    </wps:txbx>
-                    <wps:bodyPr wrap="square" lIns="0" tIns="0" rIns="0" bIns="0" rtlCol="0">
-                      <a:noAutofit/>
-                    </wps:bodyPr>
-                  </wps:wsp>
-                </a:graphicData>
-              </a:graphic>
-            </wp:anchor>
-          </w:drawing>
-        </mc:Choice>
-        <mc:Fallback>
-          <w:pict>
-            <v:shape w14:anchorId="4F6B44B4" id="Textbox 2" o:spid="_x0000_s1028" type="#_x0000_t202" style="position:absolute;margin-left:529.3pt;margin-top:44.65pt;width:47.05pt;height:12.1pt;z-index:-251661824;visibility:visible;mso-wrap-style:square;mso-wrap-distance-left:0;mso-wrap-distance-top:0;mso-wrap-distance-right:0;mso-wrap-distance-bottom:0;mso-position-horizontal:absolute;mso-position-horizontal-relative:page;mso-position-vertical:absolute;mso-position-vertical-relative:page;v-text-anchor:top" o:gfxdata="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" filled="f" stroked="f">
-              <v:textbox inset="0,0,0,0">
-                <w:txbxContent>
-                  <w:p>
-                    <w:pPr>
-                      <w:pStyle w:val="BodyText"/>
-                      <w:spacing w:before="14"/>
-                      <w:ind w:left="20"/>
-                    </w:pPr>
-                    <w:r>
-                      <w:rPr>
-                        <w:color w:val="808080"/>
-                        <w:spacing w:val="-2"/>
-                      </w:rPr>
-                      <w:t>09/06/2026</w:t>
-                    </w:r>
-                  </w:p>
-                </w:txbxContent>
-              </v:textbox>
-              <w10:wrap anchorx="page" anchory="page"/>
-            </v:shape>
-          </w:pict>
-        </mc:Fallback>
-      </mc:AlternateContent>
     </w:r>
     <w:r>
       <w:rPr>
@@ -10929,7 +10917,7 @@
         </mc:Choice>
         <mc:Fallback>
           <w:pict>
-            <v:line w14:anchorId="1E3AD7DD" id="Straight Connector 1" o:spid="_x0000_s1026" style="position:absolute;z-index:251658752;visibility:visible;mso-wrap-style:square;mso-width-percent:0;mso-height-percent:0;mso-wrap-distance-left:9pt;mso-wrap-distance-top:0;mso-wrap-distance-right:9pt;mso-wrap-distance-bottom:0;mso-position-horizontal:absolute;mso-position-horizontal-relative:margin;mso-position-vertical:absolute;mso-position-vertical-relative:text;mso-width-percent:0;mso-height-percent:0;mso-width-relative:margin;mso-height-relative:margin" from="-.05pt,2.05pt" to="579.45pt,2.05pt" o:gfxdata="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" strokecolor="black [3213]" strokeweight="2pt">
+            <v:line w14:anchorId="2F418C8A" id="Straight Connector 1" o:spid="_x0000_s1026" style="position:absolute;z-index:251658752;visibility:visible;mso-wrap-style:square;mso-width-percent:0;mso-height-percent:0;mso-wrap-distance-left:9pt;mso-wrap-distance-top:0;mso-wrap-distance-right:9pt;mso-wrap-distance-bottom:0;mso-position-horizontal:absolute;mso-position-horizontal-relative:margin;mso-position-vertical:absolute;mso-position-vertical-relative:text;mso-width-percent:0;mso-height-percent:0;mso-width-relative:margin;mso-height-relative:margin" from="-.05pt,2.05pt" to="579.45pt,2.05pt" o:gfxdata="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" strokecolor="black [3213]" strokeweight="2pt">
               <v:shadow on="t" color="black" opacity="24903f" origin=",.5" offset="0,.55556mm"/>
               <w10:wrap anchorx="margin"/>
             </v:line>

</xml_diff>